<commit_message>
Update legal materials, registration consent and site navigation
</commit_message>
<xml_diff>
--- a/content/files/code-0.docx
+++ b/content/files/code-0.docx
@@ -1,6 +1,6 @@
 
 <file path=word/document.xml><?xml version="1.0" encoding="utf-8"?>
-<w:document xmlns:wpc="http://schemas.microsoft.com/office/word/2010/wordprocessingCanvas" xmlns:cx="http://schemas.microsoft.com/office/drawing/2014/chartex" xmlns:cx1="http://schemas.microsoft.com/office/drawing/2015/9/8/chartex" xmlns:cx2="http://schemas.microsoft.com/office/drawing/2015/10/21/chartex" xmlns:cx3="http://schemas.microsoft.com/office/drawing/2016/5/9/chartex" xmlns:cx4="http://schemas.microsoft.com/office/drawing/2016/5/10/chartex" xmlns:cx5="http://schemas.microsoft.com/office/drawing/2016/5/11/chartex" xmlns:cx6="http://schemas.microsoft.com/office/drawing/2016/5/12/chartex" xmlns:cx7="http://schemas.microsoft.com/office/drawing/2016/5/13/chartex" xmlns:cx8="http://schemas.microsoft.com/office/drawing/2016/5/14/chartex" xmlns:mc="http://schemas.openxmlformats.org/markup-compatibility/2006" xmlns:aink="http://schemas.microsoft.com/office/drawing/2016/ink" xmlns:am3d="http://schemas.microsoft.com/office/drawing/2017/model3d" xmlns:o="urn:schemas-microsoft-com:office:office" xmlns:oel="http://schemas.microsoft.com/office/2019/extlst" xmlns:r="http://schemas.openxmlformats.org/officeDocument/2006/relationships" xmlns:m="http://schemas.openxmlformats.org/officeDocument/2006/math" xmlns:v="urn:schemas-microsoft-com:vml" xmlns:wp14="http://schemas.microsoft.com/office/word/2010/wordprocessingDrawing" xmlns:wp="http://schemas.openxmlformats.org/drawingml/2006/wordprocessingDrawing" xmlns:w10="urn:schemas-microsoft-com:office:word" xmlns:w="http://schemas.openxmlformats.org/wordprocessingml/2006/main" xmlns:w14="http://schemas.microsoft.com/office/word/2010/wordml" xmlns:w15="http://schemas.microsoft.com/office/word/2012/wordml" xmlns:w16cex="http://schemas.microsoft.com/office/word/2018/wordml/cex" xmlns:w16cid="http://schemas.microsoft.com/office/word/2016/wordml/cid" xmlns:w16="http://schemas.microsoft.com/office/word/2018/wordml" xmlns:w16du="http://schemas.microsoft.com/office/word/2023/wordml/word16du" xmlns:w16sdtdh="http://schemas.microsoft.com/office/word/2020/wordml/sdtdatahash" xmlns:w16se="http://schemas.microsoft.com/office/word/2015/wordml/symex" xmlns:wpg="http://schemas.microsoft.com/office/word/2010/wordprocessingGroup" xmlns:wpi="http://schemas.microsoft.com/office/word/2010/wordprocessingInk" xmlns:wne="http://schemas.microsoft.com/office/word/2006/wordml" xmlns:wps="http://schemas.microsoft.com/office/word/2010/wordprocessingShape" mc:Ignorable="w14 w15 w16se w16cid w16 w16cex w16sdtdh wp14">
+<w:document xmlns:wpc="http://schemas.microsoft.com/office/word/2010/wordprocessingCanvas" xmlns:cx="http://schemas.microsoft.com/office/drawing/2014/chartex" xmlns:cx1="http://schemas.microsoft.com/office/drawing/2015/9/8/chartex" xmlns:cx2="http://schemas.microsoft.com/office/drawing/2015/10/21/chartex" xmlns:cx3="http://schemas.microsoft.com/office/drawing/2016/5/9/chartex" xmlns:cx4="http://schemas.microsoft.com/office/drawing/2016/5/10/chartex" xmlns:cx5="http://schemas.microsoft.com/office/drawing/2016/5/11/chartex" xmlns:cx6="http://schemas.microsoft.com/office/drawing/2016/5/12/chartex" xmlns:cx7="http://schemas.microsoft.com/office/drawing/2016/5/13/chartex" xmlns:cx8="http://schemas.microsoft.com/office/drawing/2016/5/14/chartex" xmlns:mc="http://schemas.openxmlformats.org/markup-compatibility/2006" xmlns:aink="http://schemas.microsoft.com/office/drawing/2016/ink" xmlns:am3d="http://schemas.microsoft.com/office/drawing/2017/model3d" xmlns:o="urn:schemas-microsoft-com:office:office" xmlns:r="http://schemas.openxmlformats.org/officeDocument/2006/relationships" xmlns:m="http://schemas.openxmlformats.org/officeDocument/2006/math" xmlns:v="urn:schemas-microsoft-com:vml" xmlns:wp14="http://schemas.microsoft.com/office/word/2010/wordprocessingDrawing" xmlns:wp="http://schemas.openxmlformats.org/drawingml/2006/wordprocessingDrawing" xmlns:w10="urn:schemas-microsoft-com:office:word" xmlns:w="http://schemas.openxmlformats.org/wordprocessingml/2006/main" xmlns:w14="http://schemas.microsoft.com/office/word/2010/wordml" xmlns:w15="http://schemas.microsoft.com/office/word/2012/wordml" xmlns:w16cex="http://schemas.microsoft.com/office/word/2018/wordml/cex" xmlns:w16cid="http://schemas.microsoft.com/office/word/2016/wordml/cid" xmlns:w16="http://schemas.microsoft.com/office/word/2018/wordml" xmlns:w16sdtdh="http://schemas.microsoft.com/office/word/2020/wordml/sdtdatahash" xmlns:w16se="http://schemas.microsoft.com/office/word/2015/wordml/symex" xmlns:wpg="http://schemas.microsoft.com/office/word/2010/wordprocessingGroup" xmlns:wpi="http://schemas.microsoft.com/office/word/2010/wordprocessingInk" xmlns:wne="http://schemas.microsoft.com/office/word/2006/wordml" xmlns:wps="http://schemas.microsoft.com/office/word/2010/wordprocessingShape" mc:Ignorable="w14 w15 w16se w16cid w16 w16cex w16sdtdh wp14">
   <w:body>
     <w:p>
       <w:pPr>
@@ -138,25 +138,7 @@
           <w:szCs w:val="24"/>
           <w:lang w:eastAsia="ru-RU"/>
         </w:rPr>
-        <w:t> </w:t>
-      </w:r>
-      <w:proofErr w:type="gramStart"/>
-      <w:r>
-        <w:rPr>
-          <w:sz w:val="24"/>
-          <w:szCs w:val="24"/>
-          <w:lang w:eastAsia="ru-RU"/>
-        </w:rPr>
-        <w:t>- это</w:t>
-      </w:r>
-      <w:proofErr w:type="gramEnd"/>
-      <w:r>
-        <w:rPr>
-          <w:sz w:val="24"/>
-          <w:szCs w:val="24"/>
-          <w:lang w:eastAsia="ru-RU"/>
-        </w:rPr>
-        <w:t xml:space="preserve"> использование фрагментов или всей структуры чужого исходного кода без разрешения правообладателя. В юридическом </w:t>
+        <w:t xml:space="preserve"> - это использование фрагментов или всей структуры чужого исходного кода без разрешения правообладателя. В юридическом </w:t>
       </w:r>
       <w:r>
         <w:rPr>
@@ -174,16 +156,20 @@
         </w:rPr>
         <w:t xml:space="preserve"> это форма нарушения исключительных прав на программу для ЭВМ (</w:t>
       </w:r>
-      <w:r>
-        <w:rPr>
-          <w:color w:val="2E74B5" w:themeColor="accent5" w:themeShade="BF"/>
-          <w:sz w:val="24"/>
-          <w:szCs w:val="24"/>
-          <w:u w:val="single"/>
-          <w:lang w:eastAsia="ru-RU"/>
-        </w:rPr>
-        <w:t>ст. 1261 ГК РФ</w:t>
-      </w:r>
+      <w:hyperlink r:id="rId9" w:history="1">
+        <w:r>
+          <w:rPr>
+            <w:rStyle w:val="aa"/>
+            <w:color w:val="0563C1"/>
+            <w:kern w:val="0"/>
+            <w:sz w:val="24"/>
+            <w:szCs w:val="24"/>
+            <w:u w:val="single"/>
+            <w14:ligatures w14:val="none"/>
+          </w:rPr>
+          <w:t>ст. 1261 ГК РФ</w:t>
+        </w:r>
+      </w:hyperlink>
       <w:r>
         <w:rPr>
           <w:sz w:val="24"/>
@@ -631,19 +617,20 @@
         </w:rPr>
         <w:t xml:space="preserve">Согласно статье </w:t>
       </w:r>
-      <w:r>
-        <w:rPr>
-          <w:rFonts w:eastAsia="Times New Roman"/>
-          <w:color w:val="2E74B5" w:themeColor="accent5" w:themeShade="BF"/>
-          <w:kern w:val="0"/>
-          <w:sz w:val="24"/>
-          <w:szCs w:val="24"/>
-          <w:u w:val="single"/>
-          <w:lang w:eastAsia="ru-RU"/>
-          <w14:ligatures w14:val="none"/>
-        </w:rPr>
-        <w:t>82 АПК РФ</w:t>
-      </w:r>
+      <w:hyperlink r:id="rId10" w:history="1">
+        <w:r>
+          <w:rPr>
+            <w:rStyle w:val="aa"/>
+            <w:color w:val="0563C1"/>
+            <w:kern w:val="0"/>
+            <w:sz w:val="24"/>
+            <w:szCs w:val="24"/>
+            <w:u w:val="single"/>
+            <w14:ligatures w14:val="none"/>
+          </w:rPr>
+          <w:t>82 АПК РФ</w:t>
+        </w:r>
+      </w:hyperlink>
       <w:r>
         <w:rPr>
           <w:rFonts w:eastAsia="Times New Roman"/>
@@ -767,6 +754,20 @@
         </w:rPr>
         <w:t xml:space="preserve">При необходимости ходатайствовать об истребовании исходного кода другой стороны в порядке статьи </w:t>
       </w:r>
+      <w:hyperlink r:id="rId11" w:history="1">
+        <w:r>
+          <w:rPr>
+            <w:rStyle w:val="aa"/>
+            <w:color w:val="0563C1"/>
+            <w:kern w:val="0"/>
+            <w:sz w:val="24"/>
+            <w:szCs w:val="24"/>
+            <w:u w:val="single"/>
+            <w14:ligatures w14:val="none"/>
+          </w:rPr>
+          <w:t>66 АПК РФ</w:t>
+        </w:r>
+      </w:hyperlink>
       <w:r>
         <w:rPr>
           <w:rFonts w:eastAsia="Times New Roman"/>
@@ -778,7 +779,7 @@
           <w:lang w:eastAsia="ru-RU"/>
           <w14:ligatures w14:val="none"/>
         </w:rPr>
-        <w:t>66 АПК РФ.</w:t>
+        <w:t>.</w:t>
       </w:r>
     </w:p>
     <w:p>
@@ -880,7 +881,7 @@
 </file>
 
 <file path=word/endnotes.xml><?xml version="1.0" encoding="utf-8"?>
-<w:endnotes xmlns:wpc="http://schemas.microsoft.com/office/word/2010/wordprocessingCanvas" xmlns:cx="http://schemas.microsoft.com/office/drawing/2014/chartex" xmlns:cx1="http://schemas.microsoft.com/office/drawing/2015/9/8/chartex" xmlns:cx2="http://schemas.microsoft.com/office/drawing/2015/10/21/chartex" xmlns:cx3="http://schemas.microsoft.com/office/drawing/2016/5/9/chartex" xmlns:cx4="http://schemas.microsoft.com/office/drawing/2016/5/10/chartex" xmlns:cx5="http://schemas.microsoft.com/office/drawing/2016/5/11/chartex" xmlns:cx6="http://schemas.microsoft.com/office/drawing/2016/5/12/chartex" xmlns:cx7="http://schemas.microsoft.com/office/drawing/2016/5/13/chartex" xmlns:cx8="http://schemas.microsoft.com/office/drawing/2016/5/14/chartex" xmlns:mc="http://schemas.openxmlformats.org/markup-compatibility/2006" xmlns:aink="http://schemas.microsoft.com/office/drawing/2016/ink" xmlns:am3d="http://schemas.microsoft.com/office/drawing/2017/model3d" xmlns:o="urn:schemas-microsoft-com:office:office" xmlns:oel="http://schemas.microsoft.com/office/2019/extlst" xmlns:r="http://schemas.openxmlformats.org/officeDocument/2006/relationships" xmlns:m="http://schemas.openxmlformats.org/officeDocument/2006/math" xmlns:v="urn:schemas-microsoft-com:vml" xmlns:wp14="http://schemas.microsoft.com/office/word/2010/wordprocessingDrawing" xmlns:wp="http://schemas.openxmlformats.org/drawingml/2006/wordprocessingDrawing" xmlns:w10="urn:schemas-microsoft-com:office:word" xmlns:w="http://schemas.openxmlformats.org/wordprocessingml/2006/main" xmlns:w14="http://schemas.microsoft.com/office/word/2010/wordml" xmlns:w15="http://schemas.microsoft.com/office/word/2012/wordml" xmlns:w16cex="http://schemas.microsoft.com/office/word/2018/wordml/cex" xmlns:w16cid="http://schemas.microsoft.com/office/word/2016/wordml/cid" xmlns:w16="http://schemas.microsoft.com/office/word/2018/wordml" xmlns:w16du="http://schemas.microsoft.com/office/word/2023/wordml/word16du" xmlns:w16sdtdh="http://schemas.microsoft.com/office/word/2020/wordml/sdtdatahash" xmlns:w16se="http://schemas.microsoft.com/office/word/2015/wordml/symex" xmlns:wpg="http://schemas.microsoft.com/office/word/2010/wordprocessingGroup" xmlns:wpi="http://schemas.microsoft.com/office/word/2010/wordprocessingInk" xmlns:wne="http://schemas.microsoft.com/office/word/2006/wordml" xmlns:wps="http://schemas.microsoft.com/office/word/2010/wordprocessingShape" mc:Ignorable="w14 w15 w16se w16cid w16 w16cex w16sdtdh wp14">
+<w:endnotes xmlns:wpc="http://schemas.microsoft.com/office/word/2010/wordprocessingCanvas" xmlns:cx="http://schemas.microsoft.com/office/drawing/2014/chartex" xmlns:cx1="http://schemas.microsoft.com/office/drawing/2015/9/8/chartex" xmlns:cx2="http://schemas.microsoft.com/office/drawing/2015/10/21/chartex" xmlns:cx3="http://schemas.microsoft.com/office/drawing/2016/5/9/chartex" xmlns:cx4="http://schemas.microsoft.com/office/drawing/2016/5/10/chartex" xmlns:cx5="http://schemas.microsoft.com/office/drawing/2016/5/11/chartex" xmlns:cx6="http://schemas.microsoft.com/office/drawing/2016/5/12/chartex" xmlns:cx7="http://schemas.microsoft.com/office/drawing/2016/5/13/chartex" xmlns:cx8="http://schemas.microsoft.com/office/drawing/2016/5/14/chartex" xmlns:mc="http://schemas.openxmlformats.org/markup-compatibility/2006" xmlns:aink="http://schemas.microsoft.com/office/drawing/2016/ink" xmlns:am3d="http://schemas.microsoft.com/office/drawing/2017/model3d" xmlns:o="urn:schemas-microsoft-com:office:office" xmlns:r="http://schemas.openxmlformats.org/officeDocument/2006/relationships" xmlns:m="http://schemas.openxmlformats.org/officeDocument/2006/math" xmlns:v="urn:schemas-microsoft-com:vml" xmlns:wp14="http://schemas.microsoft.com/office/word/2010/wordprocessingDrawing" xmlns:wp="http://schemas.openxmlformats.org/drawingml/2006/wordprocessingDrawing" xmlns:w10="urn:schemas-microsoft-com:office:word" xmlns:w="http://schemas.openxmlformats.org/wordprocessingml/2006/main" xmlns:w14="http://schemas.microsoft.com/office/word/2010/wordml" xmlns:w15="http://schemas.microsoft.com/office/word/2012/wordml" xmlns:w16cex="http://schemas.microsoft.com/office/word/2018/wordml/cex" xmlns:w16cid="http://schemas.microsoft.com/office/word/2016/wordml/cid" xmlns:w16="http://schemas.microsoft.com/office/word/2018/wordml" xmlns:w16sdtdh="http://schemas.microsoft.com/office/word/2020/wordml/sdtdatahash" xmlns:w16se="http://schemas.microsoft.com/office/word/2015/wordml/symex" xmlns:wpg="http://schemas.microsoft.com/office/word/2010/wordprocessingGroup" xmlns:wpi="http://schemas.microsoft.com/office/word/2010/wordprocessingInk" xmlns:wne="http://schemas.microsoft.com/office/word/2006/wordml" xmlns:wps="http://schemas.microsoft.com/office/word/2010/wordprocessingShape" mc:Ignorable="w14 w15 w16se w16cid w16 w16cex w16sdtdh wp14">
   <w:endnote w:type="separator" w:id="-1">
     <w:p>
       <w:pPr>
@@ -905,7 +906,7 @@
 </file>
 
 <file path=word/footnotes.xml><?xml version="1.0" encoding="utf-8"?>
-<w:footnotes xmlns:wpc="http://schemas.microsoft.com/office/word/2010/wordprocessingCanvas" xmlns:cx="http://schemas.microsoft.com/office/drawing/2014/chartex" xmlns:cx1="http://schemas.microsoft.com/office/drawing/2015/9/8/chartex" xmlns:cx2="http://schemas.microsoft.com/office/drawing/2015/10/21/chartex" xmlns:cx3="http://schemas.microsoft.com/office/drawing/2016/5/9/chartex" xmlns:cx4="http://schemas.microsoft.com/office/drawing/2016/5/10/chartex" xmlns:cx5="http://schemas.microsoft.com/office/drawing/2016/5/11/chartex" xmlns:cx6="http://schemas.microsoft.com/office/drawing/2016/5/12/chartex" xmlns:cx7="http://schemas.microsoft.com/office/drawing/2016/5/13/chartex" xmlns:cx8="http://schemas.microsoft.com/office/drawing/2016/5/14/chartex" xmlns:mc="http://schemas.openxmlformats.org/markup-compatibility/2006" xmlns:aink="http://schemas.microsoft.com/office/drawing/2016/ink" xmlns:am3d="http://schemas.microsoft.com/office/drawing/2017/model3d" xmlns:o="urn:schemas-microsoft-com:office:office" xmlns:oel="http://schemas.microsoft.com/office/2019/extlst" xmlns:r="http://schemas.openxmlformats.org/officeDocument/2006/relationships" xmlns:m="http://schemas.openxmlformats.org/officeDocument/2006/math" xmlns:v="urn:schemas-microsoft-com:vml" xmlns:wp14="http://schemas.microsoft.com/office/word/2010/wordprocessingDrawing" xmlns:wp="http://schemas.openxmlformats.org/drawingml/2006/wordprocessingDrawing" xmlns:w10="urn:schemas-microsoft-com:office:word" xmlns:w="http://schemas.openxmlformats.org/wordprocessingml/2006/main" xmlns:w14="http://schemas.microsoft.com/office/word/2010/wordml" xmlns:w15="http://schemas.microsoft.com/office/word/2012/wordml" xmlns:w16cex="http://schemas.microsoft.com/office/word/2018/wordml/cex" xmlns:w16cid="http://schemas.microsoft.com/office/word/2016/wordml/cid" xmlns:w16="http://schemas.microsoft.com/office/word/2018/wordml" xmlns:w16du="http://schemas.microsoft.com/office/word/2023/wordml/word16du" xmlns:w16sdtdh="http://schemas.microsoft.com/office/word/2020/wordml/sdtdatahash" xmlns:w16se="http://schemas.microsoft.com/office/word/2015/wordml/symex" xmlns:wpg="http://schemas.microsoft.com/office/word/2010/wordprocessingGroup" xmlns:wpi="http://schemas.microsoft.com/office/word/2010/wordprocessingInk" xmlns:wne="http://schemas.microsoft.com/office/word/2006/wordml" xmlns:wps="http://schemas.microsoft.com/office/word/2010/wordprocessingShape" mc:Ignorable="w14 w15 w16se w16cid w16 w16cex w16sdtdh wp14">
+<w:footnotes xmlns:wpc="http://schemas.microsoft.com/office/word/2010/wordprocessingCanvas" xmlns:cx="http://schemas.microsoft.com/office/drawing/2014/chartex" xmlns:cx1="http://schemas.microsoft.com/office/drawing/2015/9/8/chartex" xmlns:cx2="http://schemas.microsoft.com/office/drawing/2015/10/21/chartex" xmlns:cx3="http://schemas.microsoft.com/office/drawing/2016/5/9/chartex" xmlns:cx4="http://schemas.microsoft.com/office/drawing/2016/5/10/chartex" xmlns:cx5="http://schemas.microsoft.com/office/drawing/2016/5/11/chartex" xmlns:cx6="http://schemas.microsoft.com/office/drawing/2016/5/12/chartex" xmlns:cx7="http://schemas.microsoft.com/office/drawing/2016/5/13/chartex" xmlns:cx8="http://schemas.microsoft.com/office/drawing/2016/5/14/chartex" xmlns:mc="http://schemas.openxmlformats.org/markup-compatibility/2006" xmlns:aink="http://schemas.microsoft.com/office/drawing/2016/ink" xmlns:am3d="http://schemas.microsoft.com/office/drawing/2017/model3d" xmlns:o="urn:schemas-microsoft-com:office:office" xmlns:r="http://schemas.openxmlformats.org/officeDocument/2006/relationships" xmlns:m="http://schemas.openxmlformats.org/officeDocument/2006/math" xmlns:v="urn:schemas-microsoft-com:vml" xmlns:wp14="http://schemas.microsoft.com/office/word/2010/wordprocessingDrawing" xmlns:wp="http://schemas.openxmlformats.org/drawingml/2006/wordprocessingDrawing" xmlns:w10="urn:schemas-microsoft-com:office:word" xmlns:w="http://schemas.openxmlformats.org/wordprocessingml/2006/main" xmlns:w14="http://schemas.microsoft.com/office/word/2010/wordml" xmlns:w15="http://schemas.microsoft.com/office/word/2012/wordml" xmlns:w16cex="http://schemas.microsoft.com/office/word/2018/wordml/cex" xmlns:w16cid="http://schemas.microsoft.com/office/word/2016/wordml/cid" xmlns:w16="http://schemas.microsoft.com/office/word/2018/wordml" xmlns:w16sdtdh="http://schemas.microsoft.com/office/word/2020/wordml/sdtdatahash" xmlns:w16se="http://schemas.microsoft.com/office/word/2015/wordml/symex" xmlns:wpg="http://schemas.microsoft.com/office/word/2010/wordprocessingGroup" xmlns:wpi="http://schemas.microsoft.com/office/word/2010/wordprocessingInk" xmlns:wne="http://schemas.microsoft.com/office/word/2006/wordml" xmlns:wps="http://schemas.microsoft.com/office/word/2010/wordprocessingShape" mc:Ignorable="w14 w15 w16se w16cid w16 w16cex w16sdtdh wp14">
   <w:footnote w:type="separator" w:id="-1">
     <w:p>
       <w:pPr>
@@ -930,7 +931,7 @@
 </file>
 
 <file path=word/numbering.xml><?xml version="1.0" encoding="utf-8"?>
-<w:numbering xmlns:wpc="http://schemas.microsoft.com/office/word/2010/wordprocessingCanvas" xmlns:cx="http://schemas.microsoft.com/office/drawing/2014/chartex" xmlns:cx1="http://schemas.microsoft.com/office/drawing/2015/9/8/chartex" xmlns:cx2="http://schemas.microsoft.com/office/drawing/2015/10/21/chartex" xmlns:cx3="http://schemas.microsoft.com/office/drawing/2016/5/9/chartex" xmlns:cx4="http://schemas.microsoft.com/office/drawing/2016/5/10/chartex" xmlns:cx5="http://schemas.microsoft.com/office/drawing/2016/5/11/chartex" xmlns:cx6="http://schemas.microsoft.com/office/drawing/2016/5/12/chartex" xmlns:cx7="http://schemas.microsoft.com/office/drawing/2016/5/13/chartex" xmlns:cx8="http://schemas.microsoft.com/office/drawing/2016/5/14/chartex" xmlns:mc="http://schemas.openxmlformats.org/markup-compatibility/2006" xmlns:aink="http://schemas.microsoft.com/office/drawing/2016/ink" xmlns:am3d="http://schemas.microsoft.com/office/drawing/2017/model3d" xmlns:o="urn:schemas-microsoft-com:office:office" xmlns:oel="http://schemas.microsoft.com/office/2019/extlst" xmlns:r="http://schemas.openxmlformats.org/officeDocument/2006/relationships" xmlns:m="http://schemas.openxmlformats.org/officeDocument/2006/math" xmlns:v="urn:schemas-microsoft-com:vml" xmlns:wp14="http://schemas.microsoft.com/office/word/2010/wordprocessingDrawing" xmlns:wp="http://schemas.openxmlformats.org/drawingml/2006/wordprocessingDrawing" xmlns:w10="urn:schemas-microsoft-com:office:word" xmlns:w="http://schemas.openxmlformats.org/wordprocessingml/2006/main" xmlns:w14="http://schemas.microsoft.com/office/word/2010/wordml" xmlns:w15="http://schemas.microsoft.com/office/word/2012/wordml" xmlns:w16cex="http://schemas.microsoft.com/office/word/2018/wordml/cex" xmlns:w16cid="http://schemas.microsoft.com/office/word/2016/wordml/cid" xmlns:w16="http://schemas.microsoft.com/office/word/2018/wordml" xmlns:w16du="http://schemas.microsoft.com/office/word/2023/wordml/word16du" xmlns:w16sdtdh="http://schemas.microsoft.com/office/word/2020/wordml/sdtdatahash" xmlns:w16se="http://schemas.microsoft.com/office/word/2015/wordml/symex" xmlns:wpg="http://schemas.microsoft.com/office/word/2010/wordprocessingGroup" xmlns:wpi="http://schemas.microsoft.com/office/word/2010/wordprocessingInk" xmlns:wne="http://schemas.microsoft.com/office/word/2006/wordml" xmlns:wps="http://schemas.microsoft.com/office/word/2010/wordprocessingShape" mc:Ignorable="w14 w15 w16se w16cid w16 w16cex w16sdtdh wp14">
+<w:numbering xmlns:wpc="http://schemas.microsoft.com/office/word/2010/wordprocessingCanvas" xmlns:cx="http://schemas.microsoft.com/office/drawing/2014/chartex" xmlns:cx1="http://schemas.microsoft.com/office/drawing/2015/9/8/chartex" xmlns:cx2="http://schemas.microsoft.com/office/drawing/2015/10/21/chartex" xmlns:cx3="http://schemas.microsoft.com/office/drawing/2016/5/9/chartex" xmlns:cx4="http://schemas.microsoft.com/office/drawing/2016/5/10/chartex" xmlns:cx5="http://schemas.microsoft.com/office/drawing/2016/5/11/chartex" xmlns:cx6="http://schemas.microsoft.com/office/drawing/2016/5/12/chartex" xmlns:cx7="http://schemas.microsoft.com/office/drawing/2016/5/13/chartex" xmlns:cx8="http://schemas.microsoft.com/office/drawing/2016/5/14/chartex" xmlns:mc="http://schemas.openxmlformats.org/markup-compatibility/2006" xmlns:aink="http://schemas.microsoft.com/office/drawing/2016/ink" xmlns:am3d="http://schemas.microsoft.com/office/drawing/2017/model3d" xmlns:o="urn:schemas-microsoft-com:office:office" xmlns:r="http://schemas.openxmlformats.org/officeDocument/2006/relationships" xmlns:m="http://schemas.openxmlformats.org/officeDocument/2006/math" xmlns:v="urn:schemas-microsoft-com:vml" xmlns:wp14="http://schemas.microsoft.com/office/word/2010/wordprocessingDrawing" xmlns:wp="http://schemas.openxmlformats.org/drawingml/2006/wordprocessingDrawing" xmlns:w10="urn:schemas-microsoft-com:office:word" xmlns:w="http://schemas.openxmlformats.org/wordprocessingml/2006/main" xmlns:w14="http://schemas.microsoft.com/office/word/2010/wordml" xmlns:w15="http://schemas.microsoft.com/office/word/2012/wordml" xmlns:w16cex="http://schemas.microsoft.com/office/word/2018/wordml/cex" xmlns:w16cid="http://schemas.microsoft.com/office/word/2016/wordml/cid" xmlns:w16="http://schemas.microsoft.com/office/word/2018/wordml" xmlns:w16sdtdh="http://schemas.microsoft.com/office/word/2020/wordml/sdtdatahash" xmlns:w16se="http://schemas.microsoft.com/office/word/2015/wordml/symex" xmlns:wpg="http://schemas.microsoft.com/office/word/2010/wordprocessingGroup" xmlns:wpi="http://schemas.microsoft.com/office/word/2010/wordprocessingInk" xmlns:wne="http://schemas.microsoft.com/office/word/2006/wordml" xmlns:wps="http://schemas.microsoft.com/office/word/2010/wordprocessingShape" mc:Ignorable="w14 w15 w16se w16cid w16 w16cex w16sdtdh wp14">
   <w:numPicBullet w:numPicBulletId="0">
     <w:pict>
       <v:shapetype id="_x0000_t75" coordsize="21600,21600" o:spt="75" o:preferrelative="t" path="m@4@5l@4@11@9@11@9@5xe" filled="f" stroked="f">
@@ -952,7 +953,7 @@
         <v:path o:extrusionok="f" gradientshapeok="t" o:connecttype="rect"/>
         <o:lock v:ext="edit" aspectratio="t"/>
       </v:shapetype>
-      <v:shape id="_x0000_i1067" type="#_x0000_t75" alt="Флажок со сплошной заливкой" style="width:11.4pt;height:10.2pt;visibility:visible" o:gfxdata="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" o:bullet="t">
+      <v:shape id="_x0000_i1033" type="#_x0000_t75" alt="Флажок со сплошной заливкой" style="width:11.35pt;height:10pt;visibility:visible" o:gfxdata="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" o:bullet="t">
         <v:imagedata r:id="rId1" o:title="" croptop="-6164f" cropbottom="-2920f"/>
       </v:shape>
     </w:pict>
@@ -1545,16 +1546,16 @@
       </w:rPr>
     </w:lvl>
   </w:abstractNum>
-  <w:num w:numId="1" w16cid:durableId="240717216">
+  <w:num w:numId="1">
     <w:abstractNumId w:val="0"/>
   </w:num>
-  <w:num w:numId="2" w16cid:durableId="582883275">
+  <w:num w:numId="2">
     <w:abstractNumId w:val="1"/>
   </w:num>
-  <w:num w:numId="3" w16cid:durableId="433523528">
+  <w:num w:numId="3">
     <w:abstractNumId w:val="3"/>
   </w:num>
-  <w:num w:numId="4" w16cid:durableId="1389036805">
+  <w:num w:numId="4">
     <w:abstractNumId w:val="2"/>
   </w:num>
 </w:numbering>
@@ -1964,7 +1965,6 @@
   <w:style w:type="character" w:default="1" w:styleId="a0">
     <w:name w:val="Default Paragraph Font"/>
     <w:uiPriority w:val="1"/>
-    <w:semiHidden/>
     <w:unhideWhenUsed/>
   </w:style>
   <w:style w:type="table" w:default="1" w:styleId="a1">
@@ -2070,6 +2070,18 @@
       <w:ind w:left="720"/>
       <w:contextualSpacing/>
     </w:pPr>
+  </w:style>
+  <w:style w:type="character" w:styleId="aa">
+    <w:name w:val="Hyperlink"/>
+    <w:basedOn w:val="a0"/>
+    <w:uiPriority w:val="99"/>
+    <w:semiHidden/>
+    <w:unhideWhenUsed/>
+    <w:rsid w:val="005D1EC3"/>
+    <w:rPr>
+      <w:color w:val="0563C1" w:themeColor="hyperlink"/>
+      <w:u w:val="single"/>
+    </w:rPr>
   </w:style>
 </w:styles>
 </file>

</xml_diff>